<commit_message>
Improved voting form with new fields
</commit_message>
<xml_diff>
--- a/public/docs/zahtev-za-glasanje.docx
+++ b/public/docs/zahtev-za-glasanje.docx
@@ -163,31 +163,30 @@
         </w:tblCellMar>
       </w:tblPr>
       <w:tblGrid>
-        <w:gridCol w:w="580"/>
+        <w:gridCol w:w="576"/>
         <w:gridCol w:w="620"/>
-        <w:gridCol w:w="1623"/>
-        <w:gridCol w:w="1533"/>
-        <w:gridCol w:w="359"/>
-        <w:gridCol w:w="359"/>
-        <w:gridCol w:w="255"/>
-        <w:gridCol w:w="104"/>
+        <w:gridCol w:w="1626"/>
+        <w:gridCol w:w="1532"/>
         <w:gridCol w:w="360"/>
-        <w:gridCol w:w="359"/>
-        <w:gridCol w:w="359"/>
-        <w:gridCol w:w="359"/>
+        <w:gridCol w:w="356"/>
+        <w:gridCol w:w="258"/>
+        <w:gridCol w:w="101"/>
+        <w:gridCol w:w="362"/>
+        <w:gridCol w:w="360"/>
+        <w:gridCol w:w="356"/>
         <w:gridCol w:w="359"/>
         <w:gridCol w:w="360"/>
+        <w:gridCol w:w="362"/>
         <w:gridCol w:w="359"/>
-        <w:gridCol w:w="359"/>
-        <w:gridCol w:w="359"/>
-        <w:gridCol w:w="354"/>
-        <w:gridCol w:w="6"/>
+        <w:gridCol w:w="356"/>
+        <w:gridCol w:w="361"/>
+        <w:gridCol w:w="362"/>
       </w:tblGrid>
       <w:tr>
         <w:trPr/>
         <w:tc>
           <w:tcPr>
-            <w:tcW w:w="580" w:type="dxa"/>
+            <w:tcW w:w="576" w:type="dxa"/>
             <w:tcBorders/>
           </w:tcPr>
           <w:p>
@@ -208,7 +207,7 @@
         </w:tc>
         <w:tc>
           <w:tcPr>
-            <w:tcW w:w="3776" w:type="dxa"/>
+            <w:tcW w:w="3778" w:type="dxa"/>
             <w:gridSpan w:val="3"/>
             <w:tcBorders/>
           </w:tcPr>
@@ -229,7 +228,7 @@
         </w:tc>
         <w:tc>
           <w:tcPr>
-            <w:tcW w:w="4670" w:type="dxa"/>
+            <w:tcW w:w="4672" w:type="dxa"/>
             <w:gridSpan w:val="14"/>
             <w:tcBorders>
               <w:bottom w:val="single" w:sz="4" w:space="0" w:color="000000"/>
@@ -261,7 +260,7 @@
         <w:trPr/>
         <w:tc>
           <w:tcPr>
-            <w:tcW w:w="580" w:type="dxa"/>
+            <w:tcW w:w="576" w:type="dxa"/>
             <w:tcBorders/>
           </w:tcPr>
           <w:p>
@@ -282,7 +281,7 @@
         </w:tc>
         <w:tc>
           <w:tcPr>
-            <w:tcW w:w="3776" w:type="dxa"/>
+            <w:tcW w:w="3778" w:type="dxa"/>
             <w:gridSpan w:val="3"/>
             <w:tcBorders/>
           </w:tcPr>
@@ -303,7 +302,7 @@
         </w:tc>
         <w:tc>
           <w:tcPr>
-            <w:tcW w:w="4670" w:type="dxa"/>
+            <w:tcW w:w="4672" w:type="dxa"/>
             <w:gridSpan w:val="14"/>
             <w:tcBorders>
               <w:top w:val="single" w:sz="4" w:space="0" w:color="000000"/>
@@ -332,7 +331,7 @@
         <w:trPr/>
         <w:tc>
           <w:tcPr>
-            <w:tcW w:w="580" w:type="dxa"/>
+            <w:tcW w:w="576" w:type="dxa"/>
             <w:tcBorders/>
           </w:tcPr>
           <w:p>
@@ -355,7 +354,7 @@
         </w:tc>
         <w:tc>
           <w:tcPr>
-            <w:tcW w:w="3776" w:type="dxa"/>
+            <w:tcW w:w="3778" w:type="dxa"/>
             <w:gridSpan w:val="3"/>
             <w:tcBorders/>
           </w:tcPr>
@@ -378,7 +377,7 @@
         </w:tc>
         <w:tc>
           <w:tcPr>
-            <w:tcW w:w="4670" w:type="dxa"/>
+            <w:tcW w:w="4672" w:type="dxa"/>
             <w:gridSpan w:val="14"/>
             <w:tcBorders>
               <w:top w:val="single" w:sz="4" w:space="0" w:color="000000"/>
@@ -406,7 +405,7 @@
         <w:trPr/>
         <w:tc>
           <w:tcPr>
-            <w:tcW w:w="580" w:type="dxa"/>
+            <w:tcW w:w="576" w:type="dxa"/>
             <w:tcBorders/>
           </w:tcPr>
           <w:p>
@@ -433,7 +432,7 @@
         </w:tc>
         <w:tc>
           <w:tcPr>
-            <w:tcW w:w="3776" w:type="dxa"/>
+            <w:tcW w:w="3778" w:type="dxa"/>
             <w:gridSpan w:val="3"/>
             <w:tcBorders>
               <w:end w:val="single" w:sz="4" w:space="0" w:color="000000"/>
@@ -456,7 +455,7 @@
         </w:tc>
         <w:tc>
           <w:tcPr>
-            <w:tcW w:w="359" w:type="dxa"/>
+            <w:tcW w:w="360" w:type="dxa"/>
             <w:tcBorders>
               <w:top w:val="single" w:sz="4" w:space="0" w:color="000000"/>
               <w:start w:val="single" w:sz="4" w:space="0" w:color="000000"/>
@@ -488,7 +487,7 @@
         </w:tc>
         <w:tc>
           <w:tcPr>
-            <w:tcW w:w="359" w:type="dxa"/>
+            <w:tcW w:w="356" w:type="dxa"/>
             <w:tcBorders>
               <w:top w:val="single" w:sz="4" w:space="0" w:color="000000"/>
               <w:start w:val="single" w:sz="4" w:space="0" w:color="000000"/>
@@ -553,7 +552,7 @@
         </w:tc>
         <w:tc>
           <w:tcPr>
-            <w:tcW w:w="360" w:type="dxa"/>
+            <w:tcW w:w="362" w:type="dxa"/>
             <w:tcBorders>
               <w:top w:val="single" w:sz="4" w:space="0" w:color="000000"/>
               <w:start w:val="single" w:sz="4" w:space="0" w:color="000000"/>
@@ -585,7 +584,7 @@
         </w:tc>
         <w:tc>
           <w:tcPr>
-            <w:tcW w:w="359" w:type="dxa"/>
+            <w:tcW w:w="360" w:type="dxa"/>
             <w:tcBorders>
               <w:top w:val="single" w:sz="4" w:space="0" w:color="000000"/>
               <w:start w:val="single" w:sz="4" w:space="0" w:color="000000"/>
@@ -617,7 +616,7 @@
         </w:tc>
         <w:tc>
           <w:tcPr>
-            <w:tcW w:w="359" w:type="dxa"/>
+            <w:tcW w:w="356" w:type="dxa"/>
             <w:tcBorders>
               <w:top w:val="single" w:sz="4" w:space="0" w:color="000000"/>
               <w:start w:val="single" w:sz="4" w:space="0" w:color="000000"/>
@@ -681,7 +680,7 @@
         </w:tc>
         <w:tc>
           <w:tcPr>
-            <w:tcW w:w="359" w:type="dxa"/>
+            <w:tcW w:w="360" w:type="dxa"/>
             <w:tcBorders>
               <w:top w:val="single" w:sz="4" w:space="0" w:color="000000"/>
               <w:start w:val="single" w:sz="4" w:space="0" w:color="000000"/>
@@ -713,7 +712,7 @@
         </w:tc>
         <w:tc>
           <w:tcPr>
-            <w:tcW w:w="360" w:type="dxa"/>
+            <w:tcW w:w="362" w:type="dxa"/>
             <w:tcBorders>
               <w:top w:val="single" w:sz="4" w:space="0" w:color="000000"/>
               <w:start w:val="single" w:sz="4" w:space="0" w:color="000000"/>
@@ -777,7 +776,7 @@
         </w:tc>
         <w:tc>
           <w:tcPr>
-            <w:tcW w:w="359" w:type="dxa"/>
+            <w:tcW w:w="356" w:type="dxa"/>
             <w:tcBorders>
               <w:top w:val="single" w:sz="4" w:space="0" w:color="000000"/>
               <w:start w:val="single" w:sz="4" w:space="0" w:color="000000"/>
@@ -809,7 +808,7 @@
         </w:tc>
         <w:tc>
           <w:tcPr>
-            <w:tcW w:w="359" w:type="dxa"/>
+            <w:tcW w:w="361" w:type="dxa"/>
             <w:tcBorders>
               <w:top w:val="single" w:sz="4" w:space="0" w:color="000000"/>
               <w:start w:val="single" w:sz="4" w:space="0" w:color="000000"/>
@@ -841,7 +840,7 @@
         </w:tc>
         <w:tc>
           <w:tcPr>
-            <w:tcW w:w="360" w:type="dxa"/>
+            <w:tcW w:w="362" w:type="dxa"/>
             <w:tcBorders>
               <w:top w:val="single" w:sz="4" w:space="0" w:color="000000"/>
               <w:start w:val="single" w:sz="4" w:space="0" w:color="000000"/>
@@ -876,7 +875,7 @@
         <w:trPr/>
         <w:tc>
           <w:tcPr>
-            <w:tcW w:w="580" w:type="dxa"/>
+            <w:tcW w:w="576" w:type="dxa"/>
             <w:tcBorders/>
           </w:tcPr>
           <w:p>
@@ -903,7 +902,7 @@
         </w:tc>
         <w:tc>
           <w:tcPr>
-            <w:tcW w:w="3776" w:type="dxa"/>
+            <w:tcW w:w="3778" w:type="dxa"/>
             <w:gridSpan w:val="3"/>
             <w:tcBorders/>
           </w:tcPr>
@@ -922,7 +921,7 @@
         </w:tc>
         <w:tc>
           <w:tcPr>
-            <w:tcW w:w="4670" w:type="dxa"/>
+            <w:tcW w:w="4672" w:type="dxa"/>
             <w:gridSpan w:val="14"/>
             <w:tcBorders>
               <w:top w:val="single" w:sz="4" w:space="0" w:color="000000"/>
@@ -951,7 +950,7 @@
         <w:trPr/>
         <w:tc>
           <w:tcPr>
-            <w:tcW w:w="580" w:type="dxa"/>
+            <w:tcW w:w="576" w:type="dxa"/>
             <w:tcBorders/>
           </w:tcPr>
           <w:p>
@@ -978,7 +977,7 @@
         </w:tc>
         <w:tc>
           <w:tcPr>
-            <w:tcW w:w="3776" w:type="dxa"/>
+            <w:tcW w:w="3778" w:type="dxa"/>
             <w:gridSpan w:val="3"/>
             <w:tcBorders/>
           </w:tcPr>
@@ -997,7 +996,7 @@
         </w:tc>
         <w:tc>
           <w:tcPr>
-            <w:tcW w:w="4670" w:type="dxa"/>
+            <w:tcW w:w="4672" w:type="dxa"/>
             <w:gridSpan w:val="14"/>
             <w:tcBorders>
               <w:top w:val="single" w:sz="4" w:space="0" w:color="000000"/>
@@ -1028,7 +1027,7 @@
         </w:trPr>
         <w:tc>
           <w:tcPr>
-            <w:tcW w:w="580" w:type="dxa"/>
+            <w:tcW w:w="576" w:type="dxa"/>
             <w:vMerge w:val="restart"/>
             <w:tcBorders/>
           </w:tcPr>
@@ -1056,7 +1055,7 @@
         </w:tc>
         <w:tc>
           <w:tcPr>
-            <w:tcW w:w="3776" w:type="dxa"/>
+            <w:tcW w:w="3778" w:type="dxa"/>
             <w:gridSpan w:val="3"/>
             <w:vMerge w:val="restart"/>
             <w:tcBorders/>
@@ -1078,7 +1077,7 @@
         </w:tc>
         <w:tc>
           <w:tcPr>
-            <w:tcW w:w="4670" w:type="dxa"/>
+            <w:tcW w:w="4672" w:type="dxa"/>
             <w:gridSpan w:val="14"/>
             <w:tcBorders>
               <w:bottom w:val="single" w:sz="4" w:space="0" w:color="000000"/>
@@ -1108,7 +1107,7 @@
         </w:trPr>
         <w:tc>
           <w:tcPr>
-            <w:tcW w:w="580" w:type="dxa"/>
+            <w:tcW w:w="576" w:type="dxa"/>
             <w:vMerge w:val="continue"/>
             <w:tcBorders/>
           </w:tcPr>
@@ -1132,7 +1131,7 @@
         </w:tc>
         <w:tc>
           <w:tcPr>
-            <w:tcW w:w="3776" w:type="dxa"/>
+            <w:tcW w:w="3778" w:type="dxa"/>
             <w:gridSpan w:val="3"/>
             <w:vMerge w:val="continue"/>
             <w:tcBorders/>
@@ -1156,7 +1155,7 @@
         </w:tc>
         <w:tc>
           <w:tcPr>
-            <w:tcW w:w="4670" w:type="dxa"/>
+            <w:tcW w:w="4672" w:type="dxa"/>
             <w:gridSpan w:val="14"/>
             <w:tcBorders>
               <w:top w:val="single" w:sz="4" w:space="0" w:color="000000"/>
@@ -1183,7 +1182,7 @@
         <w:trPr/>
         <w:tc>
           <w:tcPr>
-            <w:tcW w:w="580" w:type="dxa"/>
+            <w:tcW w:w="576" w:type="dxa"/>
             <w:tcBorders/>
             <w:tcMar>
               <w:top w:w="0" w:type="dxa"/>
@@ -1208,7 +1207,7 @@
         </w:tc>
         <w:tc>
           <w:tcPr>
-            <w:tcW w:w="8440" w:type="dxa"/>
+            <w:tcW w:w="8450" w:type="dxa"/>
             <w:gridSpan w:val="17"/>
             <w:tcBorders/>
           </w:tcPr>
@@ -1223,7 +1222,7 @@
               <w:rPr>
                 <w:lang w:val="sr-CS"/>
               </w:rPr>
-              <w:t xml:space="preserve">Уз захтев прилажем копију пасоша/личне карте Републике Србије. </w:t>
+              <w:t>Уз захтев прилажем копију пасоша/личне карте Републике Србије.</w:t>
             </w:r>
           </w:p>
         </w:tc>
@@ -1234,7 +1233,7 @@
         </w:trPr>
         <w:tc>
           <w:tcPr>
-            <w:tcW w:w="580" w:type="dxa"/>
+            <w:tcW w:w="576" w:type="dxa"/>
             <w:tcBorders/>
           </w:tcPr>
           <w:p>
@@ -1277,7 +1276,7 @@
         </w:tc>
         <w:tc>
           <w:tcPr>
-            <w:tcW w:w="1623" w:type="dxa"/>
+            <w:tcW w:w="1626" w:type="dxa"/>
             <w:tcBorders>
               <w:bottom w:val="single" w:sz="4" w:space="0" w:color="000000"/>
             </w:tcBorders>
@@ -1303,7 +1302,7 @@
         </w:tc>
         <w:tc>
           <w:tcPr>
-            <w:tcW w:w="6203" w:type="dxa"/>
+            <w:tcW w:w="6204" w:type="dxa"/>
             <w:gridSpan w:val="15"/>
             <w:tcBorders/>
             <w:tcMar>
@@ -1335,28 +1334,28 @@
         <w:trPr/>
         <w:tc>
           <w:tcPr>
-            <w:tcW w:w="580" w:type="dxa"/>
-            <w:tcBorders/>
-          </w:tcPr>
-          <w:p>
-            <w:pPr>
-              <w:pStyle w:val="Normal"/>
-              <w:snapToGrid w:val="false"/>
-              <w:jc w:val="end"/>
-              <w:rPr>
-                <w:lang w:val="sr-CS"/>
-              </w:rPr>
-            </w:pPr>
-            <w:r>
-              <w:rPr>
-                <w:lang w:val="sr-CS"/>
-              </w:rPr>
-            </w:r>
-          </w:p>
-        </w:tc>
-        <w:tc>
-          <w:tcPr>
-            <w:tcW w:w="3776" w:type="dxa"/>
+            <w:tcW w:w="576" w:type="dxa"/>
+            <w:tcBorders/>
+          </w:tcPr>
+          <w:p>
+            <w:pPr>
+              <w:pStyle w:val="Normal"/>
+              <w:snapToGrid w:val="false"/>
+              <w:jc w:val="end"/>
+              <w:rPr>
+                <w:lang w:val="sr-CS"/>
+              </w:rPr>
+            </w:pPr>
+            <w:r>
+              <w:rPr>
+                <w:lang w:val="sr-CS"/>
+              </w:rPr>
+            </w:r>
+          </w:p>
+        </w:tc>
+        <w:tc>
+          <w:tcPr>
+            <w:tcW w:w="3778" w:type="dxa"/>
             <w:gridSpan w:val="3"/>
             <w:tcBorders/>
           </w:tcPr>
@@ -1390,7 +1389,7 @@
         </w:tc>
         <w:tc>
           <w:tcPr>
-            <w:tcW w:w="4670" w:type="dxa"/>
+            <w:tcW w:w="4672" w:type="dxa"/>
             <w:gridSpan w:val="14"/>
             <w:tcBorders/>
             <w:vAlign w:val="bottom"/>
@@ -1412,7 +1411,7 @@
                 <w:szCs w:val="20"/>
                 <w:lang w:val="en-US"/>
               </w:rPr>
-              <w:t>{potpis}</w:t>
+              <w:t>{%%potpis}</w:t>
             </w:r>
           </w:p>
         </w:tc>
@@ -1423,7 +1422,7 @@
         </w:trPr>
         <w:tc>
           <w:tcPr>
-            <w:tcW w:w="580" w:type="dxa"/>
+            <w:tcW w:w="576" w:type="dxa"/>
             <w:tcBorders/>
             <w:tcMar>
               <w:top w:w="0" w:type="dxa"/>
@@ -1452,7 +1451,7 @@
         </w:tc>
         <w:tc>
           <w:tcPr>
-            <w:tcW w:w="4749" w:type="dxa"/>
+            <w:tcW w:w="4752" w:type="dxa"/>
             <w:gridSpan w:val="6"/>
             <w:tcBorders/>
             <w:tcMar>
@@ -1482,7 +1481,7 @@
         </w:tc>
         <w:tc>
           <w:tcPr>
-            <w:tcW w:w="3697" w:type="dxa"/>
+            <w:tcW w:w="3698" w:type="dxa"/>
             <w:gridSpan w:val="11"/>
             <w:tcBorders>
               <w:top w:val="single" w:sz="4" w:space="0" w:color="000000"/>
@@ -1513,32 +1512,32 @@
         <w:trPr/>
         <w:tc>
           <w:tcPr>
-            <w:tcW w:w="580" w:type="dxa"/>
-            <w:tcBorders/>
-          </w:tcPr>
-          <w:p>
-            <w:pPr>
-              <w:pStyle w:val="Normal"/>
-              <w:snapToGrid w:val="false"/>
-              <w:jc w:val="end"/>
-              <w:rPr>
-                <w:sz w:val="16"/>
-                <w:szCs w:val="16"/>
-                <w:lang w:val="sr-CS"/>
-              </w:rPr>
-            </w:pPr>
-            <w:r>
-              <w:rPr>
-                <w:sz w:val="16"/>
-                <w:szCs w:val="16"/>
-                <w:lang w:val="sr-CS"/>
-              </w:rPr>
-            </w:r>
-          </w:p>
-        </w:tc>
-        <w:tc>
-          <w:tcPr>
-            <w:tcW w:w="3776" w:type="dxa"/>
+            <w:tcW w:w="576" w:type="dxa"/>
+            <w:tcBorders/>
+          </w:tcPr>
+          <w:p>
+            <w:pPr>
+              <w:pStyle w:val="Normal"/>
+              <w:snapToGrid w:val="false"/>
+              <w:jc w:val="end"/>
+              <w:rPr>
+                <w:sz w:val="16"/>
+                <w:szCs w:val="16"/>
+                <w:lang w:val="sr-CS"/>
+              </w:rPr>
+            </w:pPr>
+            <w:r>
+              <w:rPr>
+                <w:sz w:val="16"/>
+                <w:szCs w:val="16"/>
+                <w:lang w:val="sr-CS"/>
+              </w:rPr>
+            </w:r>
+          </w:p>
+        </w:tc>
+        <w:tc>
+          <w:tcPr>
+            <w:tcW w:w="3778" w:type="dxa"/>
             <w:gridSpan w:val="3"/>
             <w:tcBorders/>
           </w:tcPr>
@@ -1559,7 +1558,7 @@
         </w:tc>
         <w:tc>
           <w:tcPr>
-            <w:tcW w:w="4670" w:type="dxa"/>
+            <w:tcW w:w="4672" w:type="dxa"/>
             <w:gridSpan w:val="14"/>
             <w:tcBorders/>
             <w:vAlign w:val="bottom"/>
@@ -1590,7 +1589,7 @@
         </w:trPr>
         <w:tc>
           <w:tcPr>
-            <w:tcW w:w="580" w:type="dxa"/>
+            <w:tcW w:w="576" w:type="dxa"/>
             <w:vMerge w:val="restart"/>
             <w:tcBorders/>
             <w:tcMar>
@@ -1622,7 +1621,7 @@
         </w:tc>
         <w:tc>
           <w:tcPr>
-            <w:tcW w:w="4749" w:type="dxa"/>
+            <w:tcW w:w="4752" w:type="dxa"/>
             <w:gridSpan w:val="6"/>
             <w:vMerge w:val="restart"/>
             <w:tcBorders/>
@@ -1655,7 +1654,7 @@
         </w:tc>
         <w:tc>
           <w:tcPr>
-            <w:tcW w:w="3697" w:type="dxa"/>
+            <w:tcW w:w="3698" w:type="dxa"/>
             <w:gridSpan w:val="11"/>
             <w:tcBorders>
               <w:top w:val="single" w:sz="4" w:space="0" w:color="000000"/>
@@ -1768,7 +1767,7 @@
         </w:trPr>
         <w:tc>
           <w:tcPr>
-            <w:tcW w:w="580" w:type="dxa"/>
+            <w:tcW w:w="576" w:type="dxa"/>
             <w:vMerge w:val="continue"/>
             <w:tcBorders/>
             <w:tcMar>
@@ -1800,7 +1799,7 @@
         </w:tc>
         <w:tc>
           <w:tcPr>
-            <w:tcW w:w="4749" w:type="dxa"/>
+            <w:tcW w:w="4752" w:type="dxa"/>
             <w:gridSpan w:val="6"/>
             <w:vMerge w:val="continue"/>
             <w:tcBorders/>
@@ -1833,7 +1832,7 @@
         </w:tc>
         <w:tc>
           <w:tcPr>
-            <w:tcW w:w="3697" w:type="dxa"/>
+            <w:tcW w:w="3698" w:type="dxa"/>
             <w:gridSpan w:val="11"/>
             <w:tcBorders>
               <w:top w:val="single" w:sz="4" w:space="0" w:color="000000"/>
@@ -2080,15 +2079,19 @@
     <w:qFormat/>
     <w:pPr>
       <w:widowControl/>
+      <w:suppressAutoHyphens w:val="true"/>
       <w:bidi w:val="0"/>
+      <w:spacing w:before="0" w:after="0"/>
+      <w:jc w:val="start"/>
     </w:pPr>
     <w:rPr>
       <w:rFonts w:ascii="TimesNewRomanPSMT;Times New Roman" w:hAnsi="TimesNewRomanPSMT;Times New Roman" w:eastAsia="Times New Roman" w:cs="TimesNewRomanPSMT;Times New Roman"/>
       <w:bCs/>
       <w:color w:val="000000"/>
+      <w:kern w:val="0"/>
       <w:sz w:val="24"/>
       <w:szCs w:val="24"/>
-      <w:lang w:val="en-US" w:bidi="ar-SA" w:eastAsia="zh-CN"/>
+      <w:lang w:val="en-US" w:eastAsia="zh-CN" w:bidi="ar-SA"/>
     </w:rPr>
   </w:style>
   <w:style w:type="character" w:styleId="DefaultParagraphFont">

</xml_diff>

<commit_message>
- Improved voting forms
</commit_message>
<xml_diff>
--- a/public/docs/zahtev-za-glasanje.docx
+++ b/public/docs/zahtev-za-glasanje.docx
@@ -163,30 +163,30 @@
         </w:tblCellMar>
       </w:tblPr>
       <w:tblGrid>
-        <w:gridCol w:w="576"/>
+        <w:gridCol w:w="575"/>
         <w:gridCol w:w="620"/>
-        <w:gridCol w:w="1626"/>
+        <w:gridCol w:w="1627"/>
         <w:gridCol w:w="1532"/>
         <w:gridCol w:w="360"/>
-        <w:gridCol w:w="356"/>
-        <w:gridCol w:w="258"/>
+        <w:gridCol w:w="355"/>
+        <w:gridCol w:w="259"/>
         <w:gridCol w:w="101"/>
         <w:gridCol w:w="362"/>
         <w:gridCol w:w="360"/>
-        <w:gridCol w:w="356"/>
-        <w:gridCol w:w="359"/>
+        <w:gridCol w:w="355"/>
+        <w:gridCol w:w="360"/>
         <w:gridCol w:w="360"/>
         <w:gridCol w:w="362"/>
         <w:gridCol w:w="359"/>
-        <w:gridCol w:w="356"/>
-        <w:gridCol w:w="361"/>
+        <w:gridCol w:w="355"/>
+        <w:gridCol w:w="362"/>
         <w:gridCol w:w="362"/>
       </w:tblGrid>
       <w:tr>
         <w:trPr/>
         <w:tc>
           <w:tcPr>
-            <w:tcW w:w="576" w:type="dxa"/>
+            <w:tcW w:w="575" w:type="dxa"/>
             <w:tcBorders/>
           </w:tcPr>
           <w:p>
@@ -207,7 +207,7 @@
         </w:tc>
         <w:tc>
           <w:tcPr>
-            <w:tcW w:w="3778" w:type="dxa"/>
+            <w:tcW w:w="3779" w:type="dxa"/>
             <w:gridSpan w:val="3"/>
             <w:tcBorders/>
           </w:tcPr>
@@ -260,7 +260,7 @@
         <w:trPr/>
         <w:tc>
           <w:tcPr>
-            <w:tcW w:w="576" w:type="dxa"/>
+            <w:tcW w:w="575" w:type="dxa"/>
             <w:tcBorders/>
           </w:tcPr>
           <w:p>
@@ -281,7 +281,7 @@
         </w:tc>
         <w:tc>
           <w:tcPr>
-            <w:tcW w:w="3778" w:type="dxa"/>
+            <w:tcW w:w="3779" w:type="dxa"/>
             <w:gridSpan w:val="3"/>
             <w:tcBorders/>
           </w:tcPr>
@@ -331,7 +331,7 @@
         <w:trPr/>
         <w:tc>
           <w:tcPr>
-            <w:tcW w:w="576" w:type="dxa"/>
+            <w:tcW w:w="575" w:type="dxa"/>
             <w:tcBorders/>
           </w:tcPr>
           <w:p>
@@ -354,7 +354,7 @@
         </w:tc>
         <w:tc>
           <w:tcPr>
-            <w:tcW w:w="3778" w:type="dxa"/>
+            <w:tcW w:w="3779" w:type="dxa"/>
             <w:gridSpan w:val="3"/>
             <w:tcBorders/>
           </w:tcPr>
@@ -405,7 +405,7 @@
         <w:trPr/>
         <w:tc>
           <w:tcPr>
-            <w:tcW w:w="576" w:type="dxa"/>
+            <w:tcW w:w="575" w:type="dxa"/>
             <w:tcBorders/>
           </w:tcPr>
           <w:p>
@@ -432,7 +432,7 @@
         </w:tc>
         <w:tc>
           <w:tcPr>
-            <w:tcW w:w="3778" w:type="dxa"/>
+            <w:tcW w:w="3779" w:type="dxa"/>
             <w:gridSpan w:val="3"/>
             <w:tcBorders>
               <w:end w:val="single" w:sz="4" w:space="0" w:color="000000"/>
@@ -487,7 +487,7 @@
         </w:tc>
         <w:tc>
           <w:tcPr>
-            <w:tcW w:w="356" w:type="dxa"/>
+            <w:tcW w:w="355" w:type="dxa"/>
             <w:tcBorders>
               <w:top w:val="single" w:sz="4" w:space="0" w:color="000000"/>
               <w:start w:val="single" w:sz="4" w:space="0" w:color="000000"/>
@@ -519,7 +519,7 @@
         </w:tc>
         <w:tc>
           <w:tcPr>
-            <w:tcW w:w="359" w:type="dxa"/>
+            <w:tcW w:w="360" w:type="dxa"/>
             <w:gridSpan w:val="2"/>
             <w:tcBorders>
               <w:top w:val="single" w:sz="4" w:space="0" w:color="000000"/>
@@ -616,7 +616,7 @@
         </w:tc>
         <w:tc>
           <w:tcPr>
-            <w:tcW w:w="356" w:type="dxa"/>
+            <w:tcW w:w="355" w:type="dxa"/>
             <w:tcBorders>
               <w:top w:val="single" w:sz="4" w:space="0" w:color="000000"/>
               <w:start w:val="single" w:sz="4" w:space="0" w:color="000000"/>
@@ -648,7 +648,7 @@
         </w:tc>
         <w:tc>
           <w:tcPr>
-            <w:tcW w:w="359" w:type="dxa"/>
+            <w:tcW w:w="360" w:type="dxa"/>
             <w:tcBorders>
               <w:top w:val="single" w:sz="4" w:space="0" w:color="000000"/>
               <w:start w:val="single" w:sz="4" w:space="0" w:color="000000"/>
@@ -776,7 +776,7 @@
         </w:tc>
         <w:tc>
           <w:tcPr>
-            <w:tcW w:w="356" w:type="dxa"/>
+            <w:tcW w:w="355" w:type="dxa"/>
             <w:tcBorders>
               <w:top w:val="single" w:sz="4" w:space="0" w:color="000000"/>
               <w:start w:val="single" w:sz="4" w:space="0" w:color="000000"/>
@@ -808,7 +808,7 @@
         </w:tc>
         <w:tc>
           <w:tcPr>
-            <w:tcW w:w="361" w:type="dxa"/>
+            <w:tcW w:w="362" w:type="dxa"/>
             <w:tcBorders>
               <w:top w:val="single" w:sz="4" w:space="0" w:color="000000"/>
               <w:start w:val="single" w:sz="4" w:space="0" w:color="000000"/>
@@ -875,7 +875,7 @@
         <w:trPr/>
         <w:tc>
           <w:tcPr>
-            <w:tcW w:w="576" w:type="dxa"/>
+            <w:tcW w:w="575" w:type="dxa"/>
             <w:tcBorders/>
           </w:tcPr>
           <w:p>
@@ -902,7 +902,7 @@
         </w:tc>
         <w:tc>
           <w:tcPr>
-            <w:tcW w:w="3778" w:type="dxa"/>
+            <w:tcW w:w="3779" w:type="dxa"/>
             <w:gridSpan w:val="3"/>
             <w:tcBorders/>
           </w:tcPr>
@@ -950,7 +950,7 @@
         <w:trPr/>
         <w:tc>
           <w:tcPr>
-            <w:tcW w:w="576" w:type="dxa"/>
+            <w:tcW w:w="575" w:type="dxa"/>
             <w:tcBorders/>
           </w:tcPr>
           <w:p>
@@ -977,7 +977,7 @@
         </w:tc>
         <w:tc>
           <w:tcPr>
-            <w:tcW w:w="3778" w:type="dxa"/>
+            <w:tcW w:w="3779" w:type="dxa"/>
             <w:gridSpan w:val="3"/>
             <w:tcBorders/>
           </w:tcPr>
@@ -1027,7 +1027,7 @@
         </w:trPr>
         <w:tc>
           <w:tcPr>
-            <w:tcW w:w="576" w:type="dxa"/>
+            <w:tcW w:w="575" w:type="dxa"/>
             <w:vMerge w:val="restart"/>
             <w:tcBorders/>
           </w:tcPr>
@@ -1055,7 +1055,7 @@
         </w:tc>
         <w:tc>
           <w:tcPr>
-            <w:tcW w:w="3778" w:type="dxa"/>
+            <w:tcW w:w="3779" w:type="dxa"/>
             <w:gridSpan w:val="3"/>
             <w:vMerge w:val="restart"/>
             <w:tcBorders/>
@@ -1107,7 +1107,7 @@
         </w:trPr>
         <w:tc>
           <w:tcPr>
-            <w:tcW w:w="576" w:type="dxa"/>
+            <w:tcW w:w="575" w:type="dxa"/>
             <w:vMerge w:val="continue"/>
             <w:tcBorders/>
           </w:tcPr>
@@ -1131,7 +1131,7 @@
         </w:tc>
         <w:tc>
           <w:tcPr>
-            <w:tcW w:w="3778" w:type="dxa"/>
+            <w:tcW w:w="3779" w:type="dxa"/>
             <w:gridSpan w:val="3"/>
             <w:vMerge w:val="continue"/>
             <w:tcBorders/>
@@ -1182,7 +1182,7 @@
         <w:trPr/>
         <w:tc>
           <w:tcPr>
-            <w:tcW w:w="576" w:type="dxa"/>
+            <w:tcW w:w="575" w:type="dxa"/>
             <w:tcBorders/>
             <w:tcMar>
               <w:top w:w="0" w:type="dxa"/>
@@ -1207,7 +1207,7 @@
         </w:tc>
         <w:tc>
           <w:tcPr>
-            <w:tcW w:w="8450" w:type="dxa"/>
+            <w:tcW w:w="8451" w:type="dxa"/>
             <w:gridSpan w:val="17"/>
             <w:tcBorders/>
           </w:tcPr>
@@ -1233,7 +1233,7 @@
         </w:trPr>
         <w:tc>
           <w:tcPr>
-            <w:tcW w:w="576" w:type="dxa"/>
+            <w:tcW w:w="575" w:type="dxa"/>
             <w:tcBorders/>
           </w:tcPr>
           <w:p>
@@ -1276,7 +1276,7 @@
         </w:tc>
         <w:tc>
           <w:tcPr>
-            <w:tcW w:w="1626" w:type="dxa"/>
+            <w:tcW w:w="1627" w:type="dxa"/>
             <w:tcBorders>
               <w:bottom w:val="single" w:sz="4" w:space="0" w:color="000000"/>
             </w:tcBorders>
@@ -1334,28 +1334,28 @@
         <w:trPr/>
         <w:tc>
           <w:tcPr>
-            <w:tcW w:w="576" w:type="dxa"/>
-            <w:tcBorders/>
-          </w:tcPr>
-          <w:p>
-            <w:pPr>
-              <w:pStyle w:val="Normal"/>
-              <w:snapToGrid w:val="false"/>
-              <w:jc w:val="end"/>
-              <w:rPr>
-                <w:lang w:val="sr-CS"/>
-              </w:rPr>
-            </w:pPr>
-            <w:r>
-              <w:rPr>
-                <w:lang w:val="sr-CS"/>
-              </w:rPr>
-            </w:r>
-          </w:p>
-        </w:tc>
-        <w:tc>
-          <w:tcPr>
-            <w:tcW w:w="3778" w:type="dxa"/>
+            <w:tcW w:w="575" w:type="dxa"/>
+            <w:tcBorders/>
+          </w:tcPr>
+          <w:p>
+            <w:pPr>
+              <w:pStyle w:val="Normal"/>
+              <w:snapToGrid w:val="false"/>
+              <w:jc w:val="end"/>
+              <w:rPr>
+                <w:lang w:val="sr-CS"/>
+              </w:rPr>
+            </w:pPr>
+            <w:r>
+              <w:rPr>
+                <w:lang w:val="sr-CS"/>
+              </w:rPr>
+            </w:r>
+          </w:p>
+        </w:tc>
+        <w:tc>
+          <w:tcPr>
+            <w:tcW w:w="3779" w:type="dxa"/>
             <w:gridSpan w:val="3"/>
             <w:tcBorders/>
           </w:tcPr>
@@ -1411,7 +1411,7 @@
                 <w:szCs w:val="20"/>
                 <w:lang w:val="en-US"/>
               </w:rPr>
-              <w:t>{%%potpis}</w:t>
+              <w:t>{%potpis}</w:t>
             </w:r>
           </w:p>
         </w:tc>
@@ -1422,7 +1422,7 @@
         </w:trPr>
         <w:tc>
           <w:tcPr>
-            <w:tcW w:w="576" w:type="dxa"/>
+            <w:tcW w:w="575" w:type="dxa"/>
             <w:tcBorders/>
             <w:tcMar>
               <w:top w:w="0" w:type="dxa"/>
@@ -1451,7 +1451,7 @@
         </w:tc>
         <w:tc>
           <w:tcPr>
-            <w:tcW w:w="4752" w:type="dxa"/>
+            <w:tcW w:w="4753" w:type="dxa"/>
             <w:gridSpan w:val="6"/>
             <w:tcBorders/>
             <w:tcMar>
@@ -1512,32 +1512,32 @@
         <w:trPr/>
         <w:tc>
           <w:tcPr>
-            <w:tcW w:w="576" w:type="dxa"/>
-            <w:tcBorders/>
-          </w:tcPr>
-          <w:p>
-            <w:pPr>
-              <w:pStyle w:val="Normal"/>
-              <w:snapToGrid w:val="false"/>
-              <w:jc w:val="end"/>
-              <w:rPr>
-                <w:sz w:val="16"/>
-                <w:szCs w:val="16"/>
-                <w:lang w:val="sr-CS"/>
-              </w:rPr>
-            </w:pPr>
-            <w:r>
-              <w:rPr>
-                <w:sz w:val="16"/>
-                <w:szCs w:val="16"/>
-                <w:lang w:val="sr-CS"/>
-              </w:rPr>
-            </w:r>
-          </w:p>
-        </w:tc>
-        <w:tc>
-          <w:tcPr>
-            <w:tcW w:w="3778" w:type="dxa"/>
+            <w:tcW w:w="575" w:type="dxa"/>
+            <w:tcBorders/>
+          </w:tcPr>
+          <w:p>
+            <w:pPr>
+              <w:pStyle w:val="Normal"/>
+              <w:snapToGrid w:val="false"/>
+              <w:jc w:val="end"/>
+              <w:rPr>
+                <w:sz w:val="16"/>
+                <w:szCs w:val="16"/>
+                <w:lang w:val="sr-CS"/>
+              </w:rPr>
+            </w:pPr>
+            <w:r>
+              <w:rPr>
+                <w:sz w:val="16"/>
+                <w:szCs w:val="16"/>
+                <w:lang w:val="sr-CS"/>
+              </w:rPr>
+            </w:r>
+          </w:p>
+        </w:tc>
+        <w:tc>
+          <w:tcPr>
+            <w:tcW w:w="3779" w:type="dxa"/>
             <w:gridSpan w:val="3"/>
             <w:tcBorders/>
           </w:tcPr>
@@ -1589,7 +1589,7 @@
         </w:trPr>
         <w:tc>
           <w:tcPr>
-            <w:tcW w:w="576" w:type="dxa"/>
+            <w:tcW w:w="575" w:type="dxa"/>
             <w:vMerge w:val="restart"/>
             <w:tcBorders/>
             <w:tcMar>
@@ -1621,7 +1621,7 @@
         </w:tc>
         <w:tc>
           <w:tcPr>
-            <w:tcW w:w="4752" w:type="dxa"/>
+            <w:tcW w:w="4753" w:type="dxa"/>
             <w:gridSpan w:val="6"/>
             <w:vMerge w:val="restart"/>
             <w:tcBorders/>
@@ -1767,7 +1767,7 @@
         </w:trPr>
         <w:tc>
           <w:tcPr>
-            <w:tcW w:w="576" w:type="dxa"/>
+            <w:tcW w:w="575" w:type="dxa"/>
             <w:vMerge w:val="continue"/>
             <w:tcBorders/>
             <w:tcMar>
@@ -1799,7 +1799,7 @@
         </w:tc>
         <w:tc>
           <w:tcPr>
-            <w:tcW w:w="4752" w:type="dxa"/>
+            <w:tcW w:w="4753" w:type="dxa"/>
             <w:gridSpan w:val="6"/>
             <w:vMerge w:val="continue"/>
             <w:tcBorders/>

</xml_diff>